<commit_message>
feat: publish v7 AI literacy course alignment
</commit_message>
<xml_diff>
--- a/worksheets/L1-L2-L3查核工具卡_學生用.docx
+++ b/worksheets/L1-L2-L3查核工具卡_學生用.docx
@@ -34,7 +34,7 @@
           <w:color w:val="1A2340"/>
           <w:sz w:val="44"/>
         </w:rPr>
-        <w:t>查主張，不猜作者</w:t>
+        <w:t>四步查核：看方向、自己找、開原文、自己判斷</w:t>
       </w:r>
     </w:p>
     <w:p>
@@ -51,7 +51,7 @@
           <w:color w:val="5B6573"/>
           <w:sz w:val="22"/>
         </w:rPr>
-        <w:t>貼進歷程本｜遇到一段很順的話，先扣留判斷，再讓來源決定顏色</w:t>
+        <w:t>貼進歷程本｜AI 或同內容紙本只提供查找方向，都不能當成證據</w:t>
       </w:r>
     </w:p>
     <w:tbl>
@@ -98,7 +98,7 @@
                 <w:color w:val="9A6700"/>
                 <w:sz w:val="22"/>
               </w:rPr>
-              <w:t>L1｜句子自己給了什麼？</w:t>
+              <w:t>① 看共同的查找方向</w:t>
             </w:r>
             <w:r>
               <w:rPr>
@@ -108,7 +108,7 @@
                 <w:color w:val="1A2340"/>
                 <w:sz w:val="20"/>
               </w:rPr>
-              <w:t xml:space="preserve">　圈作者、年份、機構、研究名、數字與分母。沒有可追線索，不准直接標綠。</w:t>
+              <w:t xml:space="preserve">　AI 或紙本可以提醒你要找作者、年份、機構、研究名、數字與分母。分母就是總共有多少人／份，例如 61／96 裡的 96；這一步還不是答案。</w:t>
             </w:r>
           </w:p>
           <w:p>
@@ -125,7 +125,7 @@
                 <w:color w:val="1D4ED8"/>
                 <w:sz w:val="22"/>
               </w:rPr>
-              <w:t>L2｜來源真的支持同一句嗎？</w:t>
+              <w:t>② 本人搜尋或查卡</w:t>
             </w:r>
             <w:r>
               <w:rPr>
@@ -135,7 +135,34 @@
                 <w:color w:val="1A2340"/>
                 <w:sz w:val="20"/>
               </w:rPr>
-              <w:t xml:space="preserve">　打開原頁，記作者／機構、日期、標題、網址；再寫它實際測了什麼、適用到誰。</w:t>
+              <w:t xml:space="preserve">　用自己的搜尋詞找資料；斷網時就查教師提供的離線來源卡。</w:t>
+            </w:r>
+          </w:p>
+          <w:p>
+            <w:pPr>
+              <w:keepNext w:val="0"/>
+              <w:keepLines w:val="0"/>
+              <w:spacing w:before="0" w:after="80" w:line="293" w:lineRule="auto"/>
+            </w:pPr>
+            <w:r>
+              <w:rPr>
+                <w:rFonts w:ascii="Arial Unicode MS" w:hAnsi="Arial Unicode MS" w:eastAsia="Arial Unicode MS"/>
+                <w:b/>
+                <w:i w:val="0"/>
+                <w:color w:val="1D4ED8"/>
+                <w:sz w:val="22"/>
+              </w:rPr>
+              <w:t>③ 打開原始資料</w:t>
+            </w:r>
+            <w:r>
+              <w:rPr>
+                <w:rFonts w:ascii="Arial Unicode MS" w:hAnsi="Arial Unicode MS" w:eastAsia="Arial Unicode MS"/>
+                <w:b w:val="0"/>
+                <w:i w:val="0"/>
+                <w:color w:val="1A2340"/>
+                <w:sz w:val="20"/>
+              </w:rPr>
+              <w:t xml:space="preserve">　原始資料是最初那份研究、報告、問卷或紀錄，不是 AI 摘要或別人的轉述。記作者或機構、日期、標題、網址或卡片編號；再寫它實際測了什麼、適用到誰。</w:t>
             </w:r>
           </w:p>
           <w:p>
@@ -152,7 +179,7 @@
                 <w:color w:val="B42338"/>
                 <w:sz w:val="22"/>
               </w:rPr>
-              <w:t>L3｜有直接衝突嗎？</w:t>
+              <w:t>④ 本人最後判斷</w:t>
             </w:r>
             <w:r>
               <w:rPr>
@@ -162,7 +189,7 @@
                 <w:color w:val="1A2340"/>
                 <w:sz w:val="20"/>
               </w:rPr>
-              <w:t xml:space="preserve">　找原文、官方資料或另一筆獨立來源；只有直接衝突才標紅，沒測量通常先留黃。</w:t>
+              <w:t xml:space="preserve">　寫下資料支持什麼、不能支持什麼，再決定 G／Y／R。只有直接衝突才標紅；沒測量通常先留黃。</w:t>
             </w:r>
           </w:p>
         </w:tc>
@@ -740,7 +767,7 @@
         <w:color w:val="7B8491"/>
         <w:sz w:val="18"/>
       </w:rPr>
-      <w:t xml:space="preserve">R.I.B. / W10 / L1-L2-L3 · 第 </w:t>
+      <w:t xml:space="preserve">R.I.B. / W10 / CHECK · 第 </w:t>
     </w:r>
     <w:r>
       <w:rPr>
@@ -789,7 +816,7 @@
         <w:color w:val="7B8491"/>
         <w:sz w:val="18"/>
       </w:rPr>
-      <w:t>R.I.B. / W10 / L1-L2-L3</w:t>
+      <w:t>R.I.B. / W10 / CHECK</w:t>
     </w:r>
     <w:r>
       <w:rPr>

</xml_diff>

<commit_message>
Align evidence lessons and staged W17 assessment
</commit_message>
<xml_diff>
--- a/worksheets/L1-L2-L3查核工具卡_學生用.docx
+++ b/worksheets/L1-L2-L3查核工具卡_學生用.docx
@@ -615,6 +615,60 @@
           <w:color w:val="1A2340"/>
           <w:sz w:val="30"/>
         </w:rPr>
+        <w:t>先分清楚：效果，還是證據？</w:t>
+      </w:r>
+    </w:p>
+    <w:p>
+      <w:pPr>
+        <w:keepNext w:val="0"/>
+        <w:keepLines w:val="0"/>
+        <w:spacing w:before="0" w:after="100" w:line="293" w:lineRule="auto"/>
+      </w:pPr>
+      <w:r>
+        <w:rPr>
+          <w:rFonts w:ascii="Arial Unicode MS" w:hAnsi="Arial Unicode MS" w:eastAsia="Arial Unicode MS"/>
+          <w:b w:val="0"/>
+          <w:i w:val="0"/>
+          <w:color w:val="1A2340"/>
+          <w:sz w:val="20"/>
+        </w:rPr>
+        <w:t>『X 有效』：沒測量先留黃。『這份資料已證明 X 有效』：若已讀到的方法與此直接衝突，可標紅。查不到研究，不等於已證明沒有研究。</w:t>
+      </w:r>
+    </w:p>
+    <w:p>
+      <w:pPr>
+        <w:keepNext/>
+        <w:keepLines w:val="0"/>
+        <w:spacing w:before="140" w:after="60" w:line="293" w:lineRule="auto"/>
+      </w:pPr>
+      <w:r>
+        <w:rPr>
+          <w:rFonts w:ascii="JetBrains Mono" w:hAnsi="JetBrains Mono" w:eastAsia="Arial Unicode MS"/>
+          <w:b/>
+          <w:i w:val="0"/>
+          <w:color w:val="1D4ED8"/>
+          <w:sz w:val="30"/>
+        </w:rPr>
+        <w:t>03</w:t>
+      </w:r>
+      <w:r>
+        <w:rPr>
+          <w:rFonts w:ascii="Arial Unicode MS" w:hAnsi="Arial Unicode MS" w:eastAsia="Arial Unicode MS"/>
+          <w:b w:val="0"/>
+          <w:i w:val="0"/>
+          <w:color w:val="1D4ED8"/>
+          <w:sz w:val="30"/>
+        </w:rPr>
+        <w:t xml:space="preserve">  </w:t>
+      </w:r>
+      <w:r>
+        <w:rPr>
+          <w:rFonts w:ascii="Arial Unicode MS" w:hAnsi="Arial Unicode MS" w:eastAsia="Arial Unicode MS"/>
+          <w:b/>
+          <w:i w:val="0"/>
+          <w:color w:val="1A2340"/>
+          <w:sz w:val="30"/>
+        </w:rPr>
         <w:t>可用入口｜課前由教師確認網址</w:t>
       </w:r>
     </w:p>

</xml_diff>